<commit_message>
Fix docx font rendering: replace SimHei with Microsoft YaHei (SimHei not on system)
</commit_message>
<xml_diff>
--- a/push_box_game_manual.docx
+++ b/push_box_game_manual.docx
@@ -7,9 +7,9 @@
         <w:spacing w:before="1200"/>
         <w:jc w:val="center"/>
       </w:pPr>
-      <w:r w:eastAsiaFont="SimHei">
+      <w:r w:eastAsiaFont="Microsoft YaHei">
         <w:rPr>
-          <w:rFonts w:ascii="SimHei" w:hAnsi="SimHei"/>
+          <w:rFonts w:ascii="Microsoft YaHei" w:hAnsi="Microsoft YaHei"/>
           <w:b/>
           <w:color w:val="0F172A"/>
           <w:sz w:val="56"/>
@@ -143,7 +143,7 @@
       </w:pPr>
       <w:r>
         <w:rPr>
-          <w:rFonts w:ascii="SimHei" w:hAnsi="SimHei"/>
+          <w:rFonts w:ascii="Microsoft YaHei" w:hAnsi="Microsoft YaHei"/>
           <w:b/>
           <w:color w:val="0F172A"/>
           <w:sz w:val="44"/>
@@ -194,9 +194,10 @@
       <w:pPr>
         <w:pStyle w:val="Heading1"/>
       </w:pPr>
-      <w:r w:eastAsiaFont="SimHei">
+      <w:r w:eastAsiaFont="Microsoft YaHei">
         <w:rPr>
-          <w:rFonts w:ascii="SimHei" w:hAnsi="SimHei"/>
+          <w:rFonts w:ascii="Microsoft YaHei" w:hAnsi="Microsoft YaHei"/>
+          <w:b/>
           <w:color w:val="0F172A"/>
         </w:rPr>
         <w:t>第一章  游戏简介</w:t>
@@ -219,9 +220,9 @@
         <w:ind w:firstLine="403"/>
         <w:jc w:val="both"/>
       </w:pPr>
-      <w:r w:eastAsiaFont="SimSun">
+      <w:r w:eastAsiaFont="Microsoft YaHei">
         <w:rPr>
-          <w:rFonts w:ascii="SimSun" w:hAnsi="SimSun"/>
+          <w:rFonts w:ascii="Microsoft YaHei" w:hAnsi="Microsoft YaHei"/>
           <w:sz w:val="22"/>
         </w:rPr>
         <w:t>推箱子（Sokoban）是一种经典的智力推理游戏，最初由Johan Stevanne于1981年创作。玩家需要将所有箱子推到指定目标位置即可关当前关卡。游戏看似简单，但难度逐渐上升，需要较好的空间思维和策略规划能力。</w:t>
@@ -232,9 +233,9 @@
         <w:ind w:firstLine="403"/>
         <w:jc w:val="both"/>
       </w:pPr>
-      <w:r w:eastAsiaFont="SimSun">
+      <w:r w:eastAsiaFont="Microsoft YaHei">
         <w:rPr>
-          <w:rFonts w:ascii="SimSun" w:hAnsi="SimSun"/>
+          <w:rFonts w:ascii="Microsoft YaHei" w:hAnsi="Microsoft YaHei"/>
           <w:sz w:val="22"/>
         </w:rPr>
         <w:t>本项目是基于Python + Pygame构建的现代版推箱子移动游戏，V1.1版本完全重构了核心代码架构，提升了稳定性和可维护性。</w:t>
@@ -260,18 +261,18 @@
             <w:shd w:fill="FEF3C7" w:val="clear"/>
           </w:tcPr>
           <w:p>
-            <w:r w:eastAsiaFont="SimHei">
+            <w:r w:eastAsiaFont="Microsoft YaHei">
               <w:rPr>
-                <w:rFonts w:ascii="SimHei" w:hAnsi="SimHei"/>
+                <w:rFonts w:ascii="Microsoft YaHei" w:hAnsi="Microsoft YaHei"/>
                 <w:b/>
                 <w:color w:val="D97706"/>
                 <w:sz w:val="20"/>
               </w:rPr>
               <w:t xml:space="preserve">核心特点 </w:t>
             </w:r>
-            <w:r w:eastAsiaFont="SimSun">
+            <w:r w:eastAsiaFont="Microsoft YaHei">
               <w:rPr>
-                <w:rFonts w:ascii="SimSun" w:hAnsi="SimSun"/>
+                <w:rFonts w:ascii="Microsoft YaHei" w:hAnsi="Microsoft YaHei"/>
                 <w:color w:val="1E293B"/>
                 <w:sz w:val="20"/>
               </w:rPr>
@@ -301,18 +302,18 @@
             <w:shd w:fill="FEF3C7" w:val="clear"/>
           </w:tcPr>
           <w:p>
-            <w:r w:eastAsiaFont="SimHei">
+            <w:r w:eastAsiaFont="Microsoft YaHei">
               <w:rPr>
-                <w:rFonts w:ascii="SimHei" w:hAnsi="SimHei"/>
+                <w:rFonts w:ascii="Microsoft YaHei" w:hAnsi="Microsoft YaHei"/>
                 <w:b/>
                 <w:color w:val="D97706"/>
                 <w:sz w:val="20"/>
               </w:rPr>
               <w:t xml:space="preserve">技术特色 </w:t>
             </w:r>
-            <w:r w:eastAsiaFont="SimSun">
+            <w:r w:eastAsiaFont="Microsoft YaHei">
               <w:rPr>
-                <w:rFonts w:ascii="SimSun" w:hAnsi="SimSun"/>
+                <w:rFonts w:ascii="Microsoft YaHei" w:hAnsi="Microsoft YaHei"/>
                 <w:color w:val="1E293B"/>
                 <w:sz w:val="20"/>
               </w:rPr>
@@ -342,18 +343,18 @@
             <w:shd w:fill="FEF3C7" w:val="clear"/>
           </w:tcPr>
           <w:p>
-            <w:r w:eastAsiaFont="SimHei">
+            <w:r w:eastAsiaFont="Microsoft YaHei">
               <w:rPr>
-                <w:rFonts w:ascii="SimHei" w:hAnsi="SimHei"/>
+                <w:rFonts w:ascii="Microsoft YaHei" w:hAnsi="Microsoft YaHei"/>
                 <w:b/>
                 <w:color w:val="D97706"/>
                 <w:sz w:val="20"/>
               </w:rPr>
               <w:t xml:space="preserve">系统要求 </w:t>
             </w:r>
-            <w:r w:eastAsiaFont="SimSun">
+            <w:r w:eastAsiaFont="Microsoft YaHei">
               <w:rPr>
-                <w:rFonts w:ascii="SimSun" w:hAnsi="SimSun"/>
+                <w:rFonts w:ascii="Microsoft YaHei" w:hAnsi="Microsoft YaHei"/>
                 <w:color w:val="1E293B"/>
                 <w:sz w:val="20"/>
               </w:rPr>
@@ -368,9 +369,10 @@
       <w:pPr>
         <w:pStyle w:val="Heading1"/>
       </w:pPr>
-      <w:r w:eastAsiaFont="SimHei">
+      <w:r w:eastAsiaFont="Microsoft YaHei">
         <w:rPr>
-          <w:rFonts w:ascii="SimHei" w:hAnsi="SimHei"/>
+          <w:rFonts w:ascii="Microsoft YaHei" w:hAnsi="Microsoft YaHei"/>
+          <w:b/>
           <w:color w:val="0F172A"/>
         </w:rPr>
         <w:t>第二章  操作指南</w:t>
@@ -392,9 +394,10 @@
       <w:pPr>
         <w:pStyle w:val="Heading2"/>
       </w:pPr>
-      <w:r w:eastAsiaFont="SimHei">
+      <w:r w:eastAsiaFont="Microsoft YaHei">
         <w:rPr>
-          <w:rFonts w:ascii="SimHei" w:hAnsi="SimHei"/>
+          <w:rFonts w:ascii="Microsoft YaHei" w:hAnsi="Microsoft YaHei"/>
+          <w:b/>
           <w:color w:val="0F172A"/>
         </w:rPr>
         <w:t>一  移动控制</w:t>
@@ -405,9 +408,9 @@
         <w:ind w:firstLine="403"/>
         <w:jc w:val="both"/>
       </w:pPr>
-      <w:r w:eastAsiaFont="SimSun">
+      <w:r w:eastAsiaFont="Microsoft YaHei">
         <w:rPr>
-          <w:rFonts w:ascii="SimSun" w:hAnsi="SimSun"/>
+          <w:rFonts w:ascii="Microsoft YaHei" w:hAnsi="Microsoft YaHei"/>
           <w:sz w:val="22"/>
         </w:rPr>
         <w:t>使用方向键或WASD键控制玩家移动：</w:t>
@@ -432,9 +435,9 @@
             <w:shd w:fill="FEF3C7" w:val="clear"/>
           </w:tcPr>
           <w:p>
-            <w:r w:eastAsiaFont="SimHei">
+            <w:r w:eastAsiaFont="Microsoft YaHei">
               <w:rPr>
-                <w:rFonts w:ascii="SimHei" w:hAnsi="SimHei"/>
+                <w:rFonts w:ascii="Microsoft YaHei" w:hAnsi="Microsoft YaHei"/>
                 <w:b/>
                 <w:color w:val="0F172A"/>
                 <w:sz w:val="20"/>
@@ -449,9 +452,9 @@
             <w:shd w:fill="FEF3C7" w:val="clear"/>
           </w:tcPr>
           <w:p>
-            <w:r w:eastAsiaFont="SimHei">
+            <w:r w:eastAsiaFont="Microsoft YaHei">
               <w:rPr>
-                <w:rFonts w:ascii="SimHei" w:hAnsi="SimHei"/>
+                <w:rFonts w:ascii="Microsoft YaHei" w:hAnsi="Microsoft YaHei"/>
                 <w:b/>
                 <w:color w:val="0F172A"/>
                 <w:sz w:val="20"/>
@@ -466,9 +469,9 @@
             <w:shd w:fill="FEF3C7" w:val="clear"/>
           </w:tcPr>
           <w:p>
-            <w:r w:eastAsiaFont="SimHei">
+            <w:r w:eastAsiaFont="Microsoft YaHei">
               <w:rPr>
-                <w:rFonts w:ascii="SimHei" w:hAnsi="SimHei"/>
+                <w:rFonts w:ascii="Microsoft YaHei" w:hAnsi="Microsoft YaHei"/>
                 <w:b/>
                 <w:color w:val="0F172A"/>
                 <w:sz w:val="20"/>
@@ -484,9 +487,9 @@
             <w:tcW w:type="dxa" w:w="3041"/>
           </w:tcPr>
           <w:p>
-            <w:r w:eastAsiaFont="SimSun">
+            <w:r w:eastAsiaFont="Microsoft YaHei">
               <w:rPr>
-                <w:rFonts w:ascii="SimSun" w:hAnsi="SimSun"/>
+                <w:rFonts w:ascii="Microsoft YaHei" w:hAnsi="Microsoft YaHei"/>
                 <w:color w:val="1E293B"/>
                 <w:sz w:val="20"/>
               </w:rPr>
@@ -502,9 +505,9 @@
             <w:tcW w:type="dxa" w:w="3041"/>
           </w:tcPr>
           <w:p>
-            <w:r w:eastAsiaFont="SimSun">
+            <w:r w:eastAsiaFont="Microsoft YaHei">
               <w:rPr>
-                <w:rFonts w:ascii="SimSun" w:hAnsi="SimSun"/>
+                <w:rFonts w:ascii="Microsoft YaHei" w:hAnsi="Microsoft YaHei"/>
                 <w:color w:val="1E293B"/>
                 <w:sz w:val="20"/>
               </w:rPr>
@@ -517,9 +520,9 @@
             <w:tcW w:type="dxa" w:w="3041"/>
           </w:tcPr>
           <w:p>
-            <w:r w:eastAsiaFont="SimSun">
+            <w:r w:eastAsiaFont="Microsoft YaHei">
               <w:rPr>
-                <w:rFonts w:ascii="SimSun" w:hAnsi="SimSun"/>
+                <w:rFonts w:ascii="Microsoft YaHei" w:hAnsi="Microsoft YaHei"/>
                 <w:color w:val="1E293B"/>
                 <w:sz w:val="20"/>
               </w:rPr>
@@ -534,9 +537,9 @@
             <w:tcW w:type="dxa" w:w="3041"/>
           </w:tcPr>
           <w:p>
-            <w:r w:eastAsiaFont="SimSun">
+            <w:r w:eastAsiaFont="Microsoft YaHei">
               <w:rPr>
-                <w:rFonts w:ascii="SimSun" w:hAnsi="SimSun"/>
+                <w:rFonts w:ascii="Microsoft YaHei" w:hAnsi="Microsoft YaHei"/>
                 <w:color w:val="1E293B"/>
                 <w:sz w:val="20"/>
               </w:rPr>
@@ -552,9 +555,9 @@
             <w:tcW w:type="dxa" w:w="3041"/>
           </w:tcPr>
           <w:p>
-            <w:r w:eastAsiaFont="SimSun">
+            <w:r w:eastAsiaFont="Microsoft YaHei">
               <w:rPr>
-                <w:rFonts w:ascii="SimSun" w:hAnsi="SimSun"/>
+                <w:rFonts w:ascii="Microsoft YaHei" w:hAnsi="Microsoft YaHei"/>
                 <w:color w:val="1E293B"/>
                 <w:sz w:val="20"/>
               </w:rPr>
@@ -567,9 +570,9 @@
             <w:tcW w:type="dxa" w:w="3041"/>
           </w:tcPr>
           <w:p>
-            <w:r w:eastAsiaFont="SimSun">
+            <w:r w:eastAsiaFont="Microsoft YaHei">
               <w:rPr>
-                <w:rFonts w:ascii="SimSun" w:hAnsi="SimSun"/>
+                <w:rFonts w:ascii="Microsoft YaHei" w:hAnsi="Microsoft YaHei"/>
                 <w:color w:val="1E293B"/>
                 <w:sz w:val="20"/>
               </w:rPr>
@@ -603,9 +606,10 @@
       <w:pPr>
         <w:pStyle w:val="Heading2"/>
       </w:pPr>
-      <w:r w:eastAsiaFont="SimHei">
+      <w:r w:eastAsiaFont="Microsoft YaHei">
         <w:rPr>
-          <w:rFonts w:ascii="SimHei" w:hAnsi="SimHei"/>
+          <w:rFonts w:ascii="Microsoft YaHei" w:hAnsi="Microsoft YaHei"/>
+          <w:b/>
           <w:color w:val="0F172A"/>
         </w:rPr>
         <w:t>二  功能按键</w:t>
@@ -628,9 +632,9 @@
             <w:shd w:fill="FEF3C7" w:val="clear"/>
           </w:tcPr>
           <w:p>
-            <w:r w:eastAsiaFont="SimHei">
+            <w:r w:eastAsiaFont="Microsoft YaHei">
               <w:rPr>
-                <w:rFonts w:ascii="SimHei" w:hAnsi="SimHei"/>
+                <w:rFonts w:ascii="Microsoft YaHei" w:hAnsi="Microsoft YaHei"/>
                 <w:b/>
                 <w:color w:val="0F172A"/>
                 <w:sz w:val="20"/>
@@ -645,9 +649,9 @@
             <w:shd w:fill="FEF3C7" w:val="clear"/>
           </w:tcPr>
           <w:p>
-            <w:r w:eastAsiaFont="SimHei">
+            <w:r w:eastAsiaFont="Microsoft YaHei">
               <w:rPr>
-                <w:rFonts w:ascii="SimHei" w:hAnsi="SimHei"/>
+                <w:rFonts w:ascii="Microsoft YaHei" w:hAnsi="Microsoft YaHei"/>
                 <w:b/>
                 <w:color w:val="0F172A"/>
                 <w:sz w:val="20"/>
@@ -679,9 +683,9 @@
             <w:tcW w:type="dxa" w:w="4561"/>
           </w:tcPr>
           <w:p>
-            <w:r w:eastAsiaFont="SimSun">
+            <w:r w:eastAsiaFont="Microsoft YaHei">
               <w:rPr>
-                <w:rFonts w:ascii="SimSun" w:hAnsi="SimSun"/>
+                <w:rFonts w:ascii="Microsoft YaHei" w:hAnsi="Microsoft YaHei"/>
                 <w:color w:val="1E293B"/>
                 <w:sz w:val="20"/>
               </w:rPr>
@@ -712,9 +716,9 @@
             <w:tcW w:type="dxa" w:w="4561"/>
           </w:tcPr>
           <w:p>
-            <w:r w:eastAsiaFont="SimSun">
+            <w:r w:eastAsiaFont="Microsoft YaHei">
               <w:rPr>
-                <w:rFonts w:ascii="SimSun" w:hAnsi="SimSun"/>
+                <w:rFonts w:ascii="Microsoft YaHei" w:hAnsi="Microsoft YaHei"/>
                 <w:color w:val="1E293B"/>
                 <w:sz w:val="20"/>
               </w:rPr>
@@ -745,9 +749,9 @@
             <w:tcW w:type="dxa" w:w="4561"/>
           </w:tcPr>
           <w:p>
-            <w:r w:eastAsiaFont="SimSun">
+            <w:r w:eastAsiaFont="Microsoft YaHei">
               <w:rPr>
-                <w:rFonts w:ascii="SimSun" w:hAnsi="SimSun"/>
+                <w:rFonts w:ascii="Microsoft YaHei" w:hAnsi="Microsoft YaHei"/>
                 <w:color w:val="1E293B"/>
                 <w:sz w:val="20"/>
               </w:rPr>
@@ -778,9 +782,9 @@
             <w:tcW w:type="dxa" w:w="4561"/>
           </w:tcPr>
           <w:p>
-            <w:r w:eastAsiaFont="SimSun">
+            <w:r w:eastAsiaFont="Microsoft YaHei">
               <w:rPr>
-                <w:rFonts w:ascii="SimSun" w:hAnsi="SimSun"/>
+                <w:rFonts w:ascii="Microsoft YaHei" w:hAnsi="Microsoft YaHei"/>
                 <w:color w:val="1E293B"/>
                 <w:sz w:val="20"/>
               </w:rPr>
@@ -811,9 +815,9 @@
             <w:tcW w:type="dxa" w:w="4561"/>
           </w:tcPr>
           <w:p>
-            <w:r w:eastAsiaFont="SimSun">
+            <w:r w:eastAsiaFont="Microsoft YaHei">
               <w:rPr>
-                <w:rFonts w:ascii="SimSun" w:hAnsi="SimSun"/>
+                <w:rFonts w:ascii="Microsoft YaHei" w:hAnsi="Microsoft YaHei"/>
                 <w:color w:val="1E293B"/>
                 <w:sz w:val="20"/>
               </w:rPr>
@@ -844,9 +848,9 @@
             <w:tcW w:type="dxa" w:w="4561"/>
           </w:tcPr>
           <w:p>
-            <w:r w:eastAsiaFont="SimSun">
+            <w:r w:eastAsiaFont="Microsoft YaHei">
               <w:rPr>
-                <w:rFonts w:ascii="SimSun" w:hAnsi="SimSun"/>
+                <w:rFonts w:ascii="Microsoft YaHei" w:hAnsi="Microsoft YaHei"/>
                 <w:color w:val="1E293B"/>
                 <w:sz w:val="20"/>
               </w:rPr>
@@ -860,9 +864,10 @@
       <w:pPr>
         <w:pStyle w:val="Heading2"/>
       </w:pPr>
-      <w:r w:eastAsiaFont="SimHei">
+      <w:r w:eastAsiaFont="Microsoft YaHei">
         <w:rPr>
-          <w:rFonts w:ascii="SimHei" w:hAnsi="SimHei"/>
+          <w:rFonts w:ascii="Microsoft YaHei" w:hAnsi="Microsoft YaHei"/>
+          <w:b/>
           <w:color w:val="0F172A"/>
         </w:rPr>
         <w:t>三  暂停菜单</w:t>
@@ -873,9 +878,9 @@
         <w:ind w:firstLine="403"/>
         <w:jc w:val="both"/>
       </w:pPr>
-      <w:r w:eastAsiaFont="SimSun">
+      <w:r w:eastAsiaFont="Microsoft YaHei">
         <w:rPr>
-          <w:rFonts w:ascii="SimSun" w:hAnsi="SimSun"/>
+          <w:rFonts w:ascii="Microsoft YaHei" w:hAnsi="Microsoft YaHei"/>
           <w:sz w:val="22"/>
         </w:rPr>
         <w:t>按 ESC 进入暂停状态，在此状态下可以使用以下操作：</w:t>
@@ -901,18 +906,18 @@
             <w:shd w:fill="FEF3C7" w:val="clear"/>
           </w:tcPr>
           <w:p>
-            <w:r w:eastAsiaFont="SimHei">
+            <w:r w:eastAsiaFont="Microsoft YaHei">
               <w:rPr>
-                <w:rFonts w:ascii="SimHei" w:hAnsi="SimHei"/>
+                <w:rFonts w:ascii="Microsoft YaHei" w:hAnsi="Microsoft YaHei"/>
                 <w:b/>
                 <w:color w:val="D97706"/>
                 <w:sz w:val="20"/>
               </w:rPr>
               <w:t xml:space="preserve">重置关卡 </w:t>
             </w:r>
-            <w:r w:eastAsiaFont="SimSun">
+            <w:r w:eastAsiaFont="Microsoft YaHei">
               <w:rPr>
-                <w:rFonts w:ascii="SimSun" w:hAnsi="SimSun"/>
+                <w:rFonts w:ascii="Microsoft YaHei" w:hAnsi="Microsoft YaHei"/>
                 <w:color w:val="1E293B"/>
                 <w:sz w:val="20"/>
               </w:rPr>
@@ -942,18 +947,18 @@
             <w:shd w:fill="FEF3C7" w:val="clear"/>
           </w:tcPr>
           <w:p>
-            <w:r w:eastAsiaFont="SimHei">
+            <w:r w:eastAsiaFont="Microsoft YaHei">
               <w:rPr>
-                <w:rFonts w:ascii="SimHei" w:hAnsi="SimHei"/>
+                <w:rFonts w:ascii="Microsoft YaHei" w:hAnsi="Microsoft YaHei"/>
                 <w:b/>
                 <w:color w:val="D97706"/>
                 <w:sz w:val="20"/>
               </w:rPr>
               <w:t xml:space="preserve">继续游戏 </w:t>
             </w:r>
-            <w:r w:eastAsiaFont="SimSun">
+            <w:r w:eastAsiaFont="Microsoft YaHei">
               <w:rPr>
-                <w:rFonts w:ascii="SimSun" w:hAnsi="SimSun"/>
+                <w:rFonts w:ascii="Microsoft YaHei" w:hAnsi="Microsoft YaHei"/>
                 <w:color w:val="1E293B"/>
                 <w:sz w:val="20"/>
               </w:rPr>
@@ -983,18 +988,18 @@
             <w:shd w:fill="FEF3C7" w:val="clear"/>
           </w:tcPr>
           <w:p>
-            <w:r w:eastAsiaFont="SimHei">
+            <w:r w:eastAsiaFont="Microsoft YaHei">
               <w:rPr>
-                <w:rFonts w:ascii="SimHei" w:hAnsi="SimHei"/>
+                <w:rFonts w:ascii="Microsoft YaHei" w:hAnsi="Microsoft YaHei"/>
                 <w:b/>
                 <w:color w:val="D97706"/>
                 <w:sz w:val="20"/>
               </w:rPr>
               <w:t xml:space="preserve">退出游戏 </w:t>
             </w:r>
-            <w:r w:eastAsiaFont="SimSun">
+            <w:r w:eastAsiaFont="Microsoft YaHei">
               <w:rPr>
-                <w:rFonts w:ascii="SimSun" w:hAnsi="SimSun"/>
+                <w:rFonts w:ascii="Microsoft YaHei" w:hAnsi="Microsoft YaHei"/>
                 <w:color w:val="1E293B"/>
                 <w:sz w:val="20"/>
               </w:rPr>
@@ -1009,9 +1014,10 @@
       <w:pPr>
         <w:pStyle w:val="Heading1"/>
       </w:pPr>
-      <w:r w:eastAsiaFont="SimHei">
+      <w:r w:eastAsiaFont="Microsoft YaHei">
         <w:rPr>
-          <w:rFonts w:ascii="SimHei" w:hAnsi="SimHei"/>
+          <w:rFonts w:ascii="Microsoft YaHei" w:hAnsi="Microsoft YaHei"/>
+          <w:b/>
           <w:color w:val="0F172A"/>
         </w:rPr>
         <w:t>第三章  游戏规则</w:t>
@@ -1033,9 +1039,10 @@
       <w:pPr>
         <w:pStyle w:val="Heading2"/>
       </w:pPr>
-      <w:r w:eastAsiaFont="SimHei">
+      <w:r w:eastAsiaFont="Microsoft YaHei">
         <w:rPr>
-          <w:rFonts w:ascii="SimHei" w:hAnsi="SimHei"/>
+          <w:rFonts w:ascii="Microsoft YaHei" w:hAnsi="Microsoft YaHei"/>
+          <w:b/>
           <w:color w:val="0F172A"/>
         </w:rPr>
         <w:t>一  目标</w:t>
@@ -1046,9 +1053,9 @@
         <w:ind w:firstLine="403"/>
         <w:jc w:val="both"/>
       </w:pPr>
-      <w:r w:eastAsiaFont="SimSun">
+      <w:r w:eastAsiaFont="Microsoft YaHei">
         <w:rPr>
-          <w:rFonts w:ascii="SimSun" w:hAnsi="SimSun"/>
+          <w:rFonts w:ascii="Microsoft YaHei" w:hAnsi="Microsoft YaHei"/>
           <w:sz w:val="22"/>
         </w:rPr>
         <w:t>在每一关中，你的任务是将所有箱子推到目标位置。当所有箱子都在目标位置上时，关卡即为通关。</w:t>
@@ -1058,9 +1065,10 @@
       <w:pPr>
         <w:pStyle w:val="Heading2"/>
       </w:pPr>
-      <w:r w:eastAsiaFont="SimHei">
+      <w:r w:eastAsiaFont="Microsoft YaHei">
         <w:rPr>
-          <w:rFonts w:ascii="SimHei" w:hAnsi="SimHei"/>
+          <w:rFonts w:ascii="Microsoft YaHei" w:hAnsi="Microsoft YaHei"/>
+          <w:b/>
           <w:color w:val="0F172A"/>
         </w:rPr>
         <w:t>二  地图元素</w:t>
@@ -1071,9 +1079,9 @@
         <w:ind w:firstLine="403"/>
         <w:jc w:val="both"/>
       </w:pPr>
-      <w:r w:eastAsiaFont="SimSun">
+      <w:r w:eastAsiaFont="Microsoft YaHei">
         <w:rPr>
-          <w:rFonts w:ascii="SimSun" w:hAnsi="SimSun"/>
+          <w:rFonts w:ascii="Microsoft YaHei" w:hAnsi="Microsoft YaHei"/>
           <w:sz w:val="22"/>
         </w:rPr>
         <w:t>关卡地图由以下元素组成：</w:t>
@@ -1097,9 +1105,9 @@
             <w:shd w:fill="FEF3C7" w:val="clear"/>
           </w:tcPr>
           <w:p>
-            <w:r w:eastAsiaFont="SimHei">
+            <w:r w:eastAsiaFont="Microsoft YaHei">
               <w:rPr>
-                <w:rFonts w:ascii="SimHei" w:hAnsi="SimHei"/>
+                <w:rFonts w:ascii="Microsoft YaHei" w:hAnsi="Microsoft YaHei"/>
                 <w:b/>
                 <w:color w:val="0F172A"/>
                 <w:sz w:val="20"/>
@@ -1114,9 +1122,9 @@
             <w:shd w:fill="FEF3C7" w:val="clear"/>
           </w:tcPr>
           <w:p>
-            <w:r w:eastAsiaFont="SimHei">
+            <w:r w:eastAsiaFont="Microsoft YaHei">
               <w:rPr>
-                <w:rFonts w:ascii="SimHei" w:hAnsi="SimHei"/>
+                <w:rFonts w:ascii="Microsoft YaHei" w:hAnsi="Microsoft YaHei"/>
                 <w:b/>
                 <w:color w:val="0F172A"/>
                 <w:sz w:val="20"/>
@@ -1131,9 +1139,9 @@
             <w:shd w:fill="FEF3C7" w:val="clear"/>
           </w:tcPr>
           <w:p>
-            <w:r w:eastAsiaFont="SimHei">
+            <w:r w:eastAsiaFont="Microsoft YaHei">
               <w:rPr>
-                <w:rFonts w:ascii="SimHei" w:hAnsi="SimHei"/>
+                <w:rFonts w:ascii="Microsoft YaHei" w:hAnsi="Microsoft YaHei"/>
                 <w:b/>
                 <w:color w:val="0F172A"/>
                 <w:sz w:val="20"/>
@@ -1149,9 +1157,9 @@
             <w:tcW w:type="dxa" w:w="3041"/>
           </w:tcPr>
           <w:p>
-            <w:r w:eastAsiaFont="SimSun">
+            <w:r w:eastAsiaFont="Microsoft YaHei">
               <w:rPr>
-                <w:rFonts w:ascii="SimSun" w:hAnsi="SimSun"/>
+                <w:rFonts w:ascii="Microsoft YaHei" w:hAnsi="Microsoft YaHei"/>
                 <w:b/>
                 <w:color w:val="1E293B"/>
                 <w:sz w:val="20"/>
@@ -1165,9 +1173,9 @@
             <w:tcW w:type="dxa" w:w="3041"/>
           </w:tcPr>
           <w:p>
-            <w:r w:eastAsiaFont="SimSun">
+            <w:r w:eastAsiaFont="Microsoft YaHei">
               <w:rPr>
-                <w:rFonts w:ascii="SimSun" w:hAnsi="SimSun"/>
+                <w:rFonts w:ascii="Microsoft YaHei" w:hAnsi="Microsoft YaHei"/>
                 <w:color w:val="1E293B"/>
                 <w:sz w:val="20"/>
               </w:rPr>
@@ -1180,9 +1188,9 @@
             <w:tcW w:type="dxa" w:w="3041"/>
           </w:tcPr>
           <w:p>
-            <w:r w:eastAsiaFont="SimSun">
+            <w:r w:eastAsiaFont="Microsoft YaHei">
               <w:rPr>
-                <w:rFonts w:ascii="SimSun" w:hAnsi="SimSun"/>
+                <w:rFonts w:ascii="Microsoft YaHei" w:hAnsi="Microsoft YaHei"/>
                 <w:color w:val="1E293B"/>
                 <w:sz w:val="20"/>
               </w:rPr>
@@ -1197,9 +1205,9 @@
             <w:tcW w:type="dxa" w:w="3041"/>
           </w:tcPr>
           <w:p>
-            <w:r w:eastAsiaFont="SimSun">
+            <w:r w:eastAsiaFont="Microsoft YaHei">
               <w:rPr>
-                <w:rFonts w:ascii="SimSun" w:hAnsi="SimSun"/>
+                <w:rFonts w:ascii="Microsoft YaHei" w:hAnsi="Microsoft YaHei"/>
                 <w:b/>
                 <w:color w:val="1E293B"/>
                 <w:sz w:val="20"/>
@@ -1213,9 +1221,9 @@
             <w:tcW w:type="dxa" w:w="3041"/>
           </w:tcPr>
           <w:p>
-            <w:r w:eastAsiaFont="SimSun">
+            <w:r w:eastAsiaFont="Microsoft YaHei">
               <w:rPr>
-                <w:rFonts w:ascii="SimSun" w:hAnsi="SimSun"/>
+                <w:rFonts w:ascii="Microsoft YaHei" w:hAnsi="Microsoft YaHei"/>
                 <w:color w:val="1E293B"/>
                 <w:sz w:val="20"/>
               </w:rPr>
@@ -1228,9 +1236,9 @@
             <w:tcW w:type="dxa" w:w="3041"/>
           </w:tcPr>
           <w:p>
-            <w:r w:eastAsiaFont="SimSun">
+            <w:r w:eastAsiaFont="Microsoft YaHei">
               <w:rPr>
-                <w:rFonts w:ascii="SimSun" w:hAnsi="SimSun"/>
+                <w:rFonts w:ascii="Microsoft YaHei" w:hAnsi="Microsoft YaHei"/>
                 <w:color w:val="1E293B"/>
                 <w:sz w:val="20"/>
               </w:rPr>
@@ -1245,9 +1253,9 @@
             <w:tcW w:type="dxa" w:w="3041"/>
           </w:tcPr>
           <w:p>
-            <w:r w:eastAsiaFont="SimSun">
+            <w:r w:eastAsiaFont="Microsoft YaHei">
               <w:rPr>
-                <w:rFonts w:ascii="SimSun" w:hAnsi="SimSun"/>
+                <w:rFonts w:ascii="Microsoft YaHei" w:hAnsi="Microsoft YaHei"/>
                 <w:b/>
                 <w:color w:val="1E293B"/>
                 <w:sz w:val="20"/>
@@ -1261,9 +1269,9 @@
             <w:tcW w:type="dxa" w:w="3041"/>
           </w:tcPr>
           <w:p>
-            <w:r w:eastAsiaFont="SimSun">
+            <w:r w:eastAsiaFont="Microsoft YaHei">
               <w:rPr>
-                <w:rFonts w:ascii="SimSun" w:hAnsi="SimSun"/>
+                <w:rFonts w:ascii="Microsoft YaHei" w:hAnsi="Microsoft YaHei"/>
                 <w:color w:val="1E293B"/>
                 <w:sz w:val="20"/>
               </w:rPr>
@@ -1276,9 +1284,9 @@
             <w:tcW w:type="dxa" w:w="3041"/>
           </w:tcPr>
           <w:p>
-            <w:r w:eastAsiaFont="SimSun">
+            <w:r w:eastAsiaFont="Microsoft YaHei">
               <w:rPr>
-                <w:rFonts w:ascii="SimSun" w:hAnsi="SimSun"/>
+                <w:rFonts w:ascii="Microsoft YaHei" w:hAnsi="Microsoft YaHei"/>
                 <w:color w:val="1E293B"/>
                 <w:sz w:val="20"/>
               </w:rPr>
@@ -1293,9 +1301,9 @@
             <w:tcW w:type="dxa" w:w="3041"/>
           </w:tcPr>
           <w:p>
-            <w:r w:eastAsiaFont="SimSun">
+            <w:r w:eastAsiaFont="Microsoft YaHei">
               <w:rPr>
-                <w:rFonts w:ascii="SimSun" w:hAnsi="SimSun"/>
+                <w:rFonts w:ascii="Microsoft YaHei" w:hAnsi="Microsoft YaHei"/>
                 <w:b/>
                 <w:color w:val="1E293B"/>
                 <w:sz w:val="20"/>
@@ -1309,9 +1317,9 @@
             <w:tcW w:type="dxa" w:w="3041"/>
           </w:tcPr>
           <w:p>
-            <w:r w:eastAsiaFont="SimSun">
+            <w:r w:eastAsiaFont="Microsoft YaHei">
               <w:rPr>
-                <w:rFonts w:ascii="SimSun" w:hAnsi="SimSun"/>
+                <w:rFonts w:ascii="Microsoft YaHei" w:hAnsi="Microsoft YaHei"/>
                 <w:color w:val="1E293B"/>
                 <w:sz w:val="20"/>
               </w:rPr>
@@ -1324,9 +1332,9 @@
             <w:tcW w:type="dxa" w:w="3041"/>
           </w:tcPr>
           <w:p>
-            <w:r w:eastAsiaFont="SimSun">
+            <w:r w:eastAsiaFont="Microsoft YaHei">
               <w:rPr>
-                <w:rFonts w:ascii="SimSun" w:hAnsi="SimSun"/>
+                <w:rFonts w:ascii="Microsoft YaHei" w:hAnsi="Microsoft YaHei"/>
                 <w:color w:val="1E293B"/>
                 <w:sz w:val="20"/>
               </w:rPr>
@@ -1341,9 +1349,9 @@
             <w:tcW w:type="dxa" w:w="3041"/>
           </w:tcPr>
           <w:p>
-            <w:r w:eastAsiaFont="SimSun">
+            <w:r w:eastAsiaFont="Microsoft YaHei">
               <w:rPr>
-                <w:rFonts w:ascii="SimSun" w:hAnsi="SimSun"/>
+                <w:rFonts w:ascii="Microsoft YaHei" w:hAnsi="Microsoft YaHei"/>
                 <w:b/>
                 <w:color w:val="1E293B"/>
                 <w:sz w:val="20"/>
@@ -1357,9 +1365,9 @@
             <w:tcW w:type="dxa" w:w="3041"/>
           </w:tcPr>
           <w:p>
-            <w:r w:eastAsiaFont="SimSun">
+            <w:r w:eastAsiaFont="Microsoft YaHei">
               <w:rPr>
-                <w:rFonts w:ascii="SimSun" w:hAnsi="SimSun"/>
+                <w:rFonts w:ascii="Microsoft YaHei" w:hAnsi="Microsoft YaHei"/>
                 <w:color w:val="1E293B"/>
                 <w:sz w:val="20"/>
               </w:rPr>
@@ -1372,9 +1380,9 @@
             <w:tcW w:type="dxa" w:w="3041"/>
           </w:tcPr>
           <w:p>
-            <w:r w:eastAsiaFont="SimSun">
+            <w:r w:eastAsiaFont="Microsoft YaHei">
               <w:rPr>
-                <w:rFonts w:ascii="SimSun" w:hAnsi="SimSun"/>
+                <w:rFonts w:ascii="Microsoft YaHei" w:hAnsi="Microsoft YaHei"/>
                 <w:color w:val="1E293B"/>
                 <w:sz w:val="20"/>
               </w:rPr>
@@ -1389,9 +1397,9 @@
             <w:tcW w:type="dxa" w:w="3041"/>
           </w:tcPr>
           <w:p>
-            <w:r w:eastAsiaFont="SimSun">
+            <w:r w:eastAsiaFont="Microsoft YaHei">
               <w:rPr>
-                <w:rFonts w:ascii="SimSun" w:hAnsi="SimSun"/>
+                <w:rFonts w:ascii="Microsoft YaHei" w:hAnsi="Microsoft YaHei"/>
                 <w:color w:val="1E293B"/>
                 <w:sz w:val="20"/>
               </w:rPr>
@@ -1404,9 +1412,9 @@
             <w:tcW w:type="dxa" w:w="3041"/>
           </w:tcPr>
           <w:p>
-            <w:r w:eastAsiaFont="SimSun">
+            <w:r w:eastAsiaFont="Microsoft YaHei">
               <w:rPr>
-                <w:rFonts w:ascii="SimSun" w:hAnsi="SimSun"/>
+                <w:rFonts w:ascii="Microsoft YaHei" w:hAnsi="Microsoft YaHei"/>
                 <w:color w:val="1E293B"/>
                 <w:sz w:val="20"/>
               </w:rPr>
@@ -1419,9 +1427,9 @@
             <w:tcW w:type="dxa" w:w="3041"/>
           </w:tcPr>
           <w:p>
-            <w:r w:eastAsiaFont="SimSun">
+            <w:r w:eastAsiaFont="Microsoft YaHei">
               <w:rPr>
-                <w:rFonts w:ascii="SimSun" w:hAnsi="SimSun"/>
+                <w:rFonts w:ascii="Microsoft YaHei" w:hAnsi="Microsoft YaHei"/>
                 <w:color w:val="1E293B"/>
                 <w:sz w:val="20"/>
               </w:rPr>
@@ -1436,9 +1444,9 @@
             <w:tcW w:type="dxa" w:w="3041"/>
           </w:tcPr>
           <w:p>
-            <w:r w:eastAsiaFont="SimSun">
+            <w:r w:eastAsiaFont="Microsoft YaHei">
               <w:rPr>
-                <w:rFonts w:ascii="SimSun" w:hAnsi="SimSun"/>
+                <w:rFonts w:ascii="Microsoft YaHei" w:hAnsi="Microsoft YaHei"/>
                 <w:color w:val="1E293B"/>
                 <w:sz w:val="20"/>
               </w:rPr>
@@ -1451,9 +1459,9 @@
             <w:tcW w:type="dxa" w:w="3041"/>
           </w:tcPr>
           <w:p>
-            <w:r w:eastAsiaFont="SimSun">
+            <w:r w:eastAsiaFont="Microsoft YaHei">
               <w:rPr>
-                <w:rFonts w:ascii="SimSun" w:hAnsi="SimSun"/>
+                <w:rFonts w:ascii="Microsoft YaHei" w:hAnsi="Microsoft YaHei"/>
                 <w:color w:val="1E293B"/>
                 <w:sz w:val="20"/>
               </w:rPr>
@@ -1466,9 +1474,9 @@
             <w:tcW w:type="dxa" w:w="3041"/>
           </w:tcPr>
           <w:p>
-            <w:r w:eastAsiaFont="SimSun">
+            <w:r w:eastAsiaFont="Microsoft YaHei">
               <w:rPr>
-                <w:rFonts w:ascii="SimSun" w:hAnsi="SimSun"/>
+                <w:rFonts w:ascii="Microsoft YaHei" w:hAnsi="Microsoft YaHei"/>
                 <w:color w:val="1E293B"/>
                 <w:sz w:val="20"/>
               </w:rPr>
@@ -1482,9 +1490,10 @@
       <w:pPr>
         <w:pStyle w:val="Heading2"/>
       </w:pPr>
-      <w:r w:eastAsiaFont="SimHei">
+      <w:r w:eastAsiaFont="Microsoft YaHei">
         <w:rPr>
-          <w:rFonts w:ascii="SimHei" w:hAnsi="SimHei"/>
+          <w:rFonts w:ascii="Microsoft YaHei" w:hAnsi="Microsoft YaHei"/>
+          <w:b/>
           <w:color w:val="0F172A"/>
         </w:rPr>
         <w:t>三  移动规则</w:t>
@@ -1495,9 +1504,9 @@
         <w:ind w:firstLine="403"/>
         <w:jc w:val="both"/>
       </w:pPr>
-      <w:r w:eastAsiaFont="SimSun">
+      <w:r w:eastAsiaFont="Microsoft YaHei">
         <w:rPr>
-          <w:rFonts w:ascii="SimSun" w:hAnsi="SimSun"/>
+          <w:rFonts w:ascii="Microsoft YaHei" w:hAnsi="Microsoft YaHei"/>
           <w:sz w:val="22"/>
         </w:rPr>
         <w:t>一  玩家可以自由走到任意无墙的地板方向；</w:t>
@@ -1508,9 +1517,9 @@
         <w:ind w:firstLine="403"/>
         <w:jc w:val="both"/>
       </w:pPr>
-      <w:r w:eastAsiaFont="SimSun">
+      <w:r w:eastAsiaFont="Microsoft YaHei">
         <w:rPr>
-          <w:rFonts w:ascii="SimSun" w:hAnsi="SimSun"/>
+          <w:rFonts w:ascii="Microsoft YaHei" w:hAnsi="Microsoft YaHei"/>
           <w:sz w:val="22"/>
         </w:rPr>
         <w:t>二  玩家可以在箱子后方，将箱子推到前方的地板上（包括在目标位置上）；</w:t>
@@ -1521,9 +1530,9 @@
         <w:ind w:firstLine="403"/>
         <w:jc w:val="both"/>
       </w:pPr>
-      <w:r w:eastAsiaFont="SimSun">
+      <w:r w:eastAsiaFont="Microsoft YaHei">
         <w:rPr>
-          <w:rFonts w:ascii="SimSun" w:hAnsi="SimSun"/>
+          <w:rFonts w:ascii="Microsoft YaHei" w:hAnsi="Microsoft YaHei"/>
           <w:sz w:val="22"/>
         </w:rPr>
         <w:t>三  箱子只能被推，不能被拉；</w:t>
@@ -1534,9 +1543,9 @@
         <w:ind w:firstLine="403"/>
         <w:jc w:val="both"/>
       </w:pPr>
-      <w:r w:eastAsiaFont="SimSun">
+      <w:r w:eastAsiaFont="Microsoft YaHei">
         <w:rPr>
-          <w:rFonts w:ascii="SimSun" w:hAnsi="SimSun"/>
+          <w:rFonts w:ascii="Microsoft YaHei" w:hAnsi="Microsoft YaHei"/>
           <w:sz w:val="22"/>
         </w:rPr>
         <w:t>四  玩家无法穿越墙、箱子或其他障碍物；</w:t>
@@ -1547,9 +1556,9 @@
         <w:ind w:firstLine="403"/>
         <w:jc w:val="both"/>
       </w:pPr>
-      <w:r w:eastAsiaFont="SimSun">
+      <w:r w:eastAsiaFont="Microsoft YaHei">
         <w:rPr>
-          <w:rFonts w:ascii="SimSun" w:hAnsi="SimSun"/>
+          <w:rFonts w:ascii="Microsoft YaHei" w:hAnsi="Microsoft YaHei"/>
           <w:sz w:val="22"/>
         </w:rPr>
         <w:t>五  如果箱子前方是墙或另一个箱子，则无法推动，提示 BLOCKED（被阻止）。</w:t>
@@ -1559,9 +1568,10 @@
       <w:pPr>
         <w:pStyle w:val="Heading2"/>
       </w:pPr>
-      <w:r w:eastAsiaFont="SimHei">
+      <w:r w:eastAsiaFont="Microsoft YaHei">
         <w:rPr>
-          <w:rFonts w:ascii="SimHei" w:hAnsi="SimHei"/>
+          <w:rFonts w:ascii="Microsoft YaHei" w:hAnsi="Microsoft YaHei"/>
+          <w:b/>
           <w:color w:val="0F172A"/>
         </w:rPr>
         <w:t>四  关卡解关条件</w:t>
@@ -1572,9 +1582,9 @@
         <w:ind w:firstLine="403"/>
         <w:jc w:val="both"/>
       </w:pPr>
-      <w:r w:eastAsiaFont="SimSun">
+      <w:r w:eastAsiaFont="Microsoft YaHei">
         <w:rPr>
-          <w:rFonts w:ascii="SimSun" w:hAnsi="SimSun"/>
+          <w:rFonts w:ascii="Microsoft YaHei" w:hAnsi="Microsoft YaHei"/>
           <w:sz w:val="22"/>
         </w:rPr>
         <w:t>当且仅当所有箱子都处于目标位置时，关卡才视为完成。如果某个箱子已经在目标上，你可以将它推开，但最终所有箱子都必须回到目标位置。</w:t>
@@ -1600,18 +1610,18 @@
             <w:shd w:fill="FEF3C7" w:val="clear"/>
           </w:tcPr>
           <w:p>
-            <w:r w:eastAsiaFont="SimHei">
+            <w:r w:eastAsiaFont="Microsoft YaHei">
               <w:rPr>
-                <w:rFonts w:ascii="SimHei" w:hAnsi="SimHei"/>
+                <w:rFonts w:ascii="Microsoft YaHei" w:hAnsi="Microsoft YaHei"/>
                 <w:b/>
                 <w:color w:val="D97706"/>
                 <w:sz w:val="20"/>
               </w:rPr>
               <w:t xml:space="preserve">警告 </w:t>
             </w:r>
-            <w:r w:eastAsiaFont="SimSun">
+            <w:r w:eastAsiaFont="Microsoft YaHei">
               <w:rPr>
-                <w:rFonts w:ascii="SimSun" w:hAnsi="SimSun"/>
+                <w:rFonts w:ascii="Microsoft YaHei" w:hAnsi="Microsoft YaHei"/>
                 <w:color w:val="1E293B"/>
                 <w:sz w:val="20"/>
               </w:rPr>
@@ -1626,9 +1636,10 @@
       <w:pPr>
         <w:pStyle w:val="Heading1"/>
       </w:pPr>
-      <w:r w:eastAsiaFont="SimHei">
+      <w:r w:eastAsiaFont="Microsoft YaHei">
         <w:rPr>
-          <w:rFonts w:ascii="SimHei" w:hAnsi="SimHei"/>
+          <w:rFonts w:ascii="Microsoft YaHei" w:hAnsi="Microsoft YaHei"/>
+          <w:b/>
           <w:color w:val="0F172A"/>
         </w:rPr>
         <w:t>第四章  关卡说明</w:t>
@@ -1651,9 +1662,9 @@
         <w:ind w:firstLine="403"/>
         <w:jc w:val="both"/>
       </w:pPr>
-      <w:r w:eastAsiaFont="SimSun">
+      <w:r w:eastAsiaFont="Microsoft YaHei">
         <w:rPr>
-          <w:rFonts w:ascii="SimSun" w:hAnsi="SimSun"/>
+          <w:rFonts w:ascii="Microsoft YaHei" w:hAnsi="Microsoft YaHei"/>
           <w:sz w:val="22"/>
         </w:rPr>
         <w:t>本游戏预置了 7 关经典推箱子关卡，难度从简单到困难逐渐上升。你可以使用 Tab 键在关卡之间切换。</w:t>
@@ -1663,9 +1674,10 @@
       <w:pPr>
         <w:pStyle w:val="Heading2"/>
       </w:pPr>
-      <w:r w:eastAsiaFont="SimHei">
+      <w:r w:eastAsiaFont="Microsoft YaHei">
         <w:rPr>
-          <w:rFonts w:ascii="SimHei" w:hAnsi="SimHei"/>
+          <w:rFonts w:ascii="Microsoft YaHei" w:hAnsi="Microsoft YaHei"/>
+          <w:b/>
           <w:color w:val="0F172A"/>
         </w:rPr>
         <w:t>关卡列表</w:t>
@@ -1690,9 +1702,9 @@
             <w:shd w:fill="FEF3C7" w:val="clear"/>
           </w:tcPr>
           <w:p>
-            <w:r w:eastAsiaFont="SimHei">
+            <w:r w:eastAsiaFont="Microsoft YaHei">
               <w:rPr>
-                <w:rFonts w:ascii="SimHei" w:hAnsi="SimHei"/>
+                <w:rFonts w:ascii="Microsoft YaHei" w:hAnsi="Microsoft YaHei"/>
                 <w:b/>
                 <w:color w:val="0F172A"/>
                 <w:sz w:val="20"/>
@@ -1707,9 +1719,9 @@
             <w:shd w:fill="FEF3C7" w:val="clear"/>
           </w:tcPr>
           <w:p>
-            <w:r w:eastAsiaFont="SimHei">
+            <w:r w:eastAsiaFont="Microsoft YaHei">
               <w:rPr>
-                <w:rFonts w:ascii="SimHei" w:hAnsi="SimHei"/>
+                <w:rFonts w:ascii="Microsoft YaHei" w:hAnsi="Microsoft YaHei"/>
                 <w:b/>
                 <w:color w:val="0F172A"/>
                 <w:sz w:val="20"/>
@@ -1724,9 +1736,9 @@
             <w:shd w:fill="FEF3C7" w:val="clear"/>
           </w:tcPr>
           <w:p>
-            <w:r w:eastAsiaFont="SimHei">
+            <w:r w:eastAsiaFont="Microsoft YaHei">
               <w:rPr>
-                <w:rFonts w:ascii="SimHei" w:hAnsi="SimHei"/>
+                <w:rFonts w:ascii="Microsoft YaHei" w:hAnsi="Microsoft YaHei"/>
                 <w:b/>
                 <w:color w:val="0F172A"/>
                 <w:sz w:val="20"/>
@@ -1741,9 +1753,9 @@
             <w:shd w:fill="FEF3C7" w:val="clear"/>
           </w:tcPr>
           <w:p>
-            <w:r w:eastAsiaFont="SimHei">
+            <w:r w:eastAsiaFont="Microsoft YaHei">
               <w:rPr>
-                <w:rFonts w:ascii="SimHei" w:hAnsi="SimHei"/>
+                <w:rFonts w:ascii="Microsoft YaHei" w:hAnsi="Microsoft YaHei"/>
                 <w:b/>
                 <w:color w:val="0F172A"/>
                 <w:sz w:val="20"/>
@@ -1759,9 +1771,9 @@
             <w:tcW w:type="dxa" w:w="2280"/>
           </w:tcPr>
           <w:p>
-            <w:r w:eastAsiaFont="SimSun">
+            <w:r w:eastAsiaFont="Microsoft YaHei">
               <w:rPr>
-                <w:rFonts w:ascii="SimSun" w:hAnsi="SimSun"/>
+                <w:rFonts w:ascii="Microsoft YaHei" w:hAnsi="Microsoft YaHei"/>
                 <w:color w:val="1E293B"/>
                 <w:sz w:val="20"/>
               </w:rPr>
@@ -1774,9 +1786,9 @@
             <w:tcW w:type="dxa" w:w="2280"/>
           </w:tcPr>
           <w:p>
-            <w:r w:eastAsiaFont="SimSun">
+            <w:r w:eastAsiaFont="Microsoft YaHei">
               <w:rPr>
-                <w:rFonts w:ascii="SimSun" w:hAnsi="SimSun"/>
+                <w:rFonts w:ascii="Microsoft YaHei" w:hAnsi="Microsoft YaHei"/>
                 <w:color w:val="1E293B"/>
                 <w:sz w:val="20"/>
               </w:rPr>
@@ -1789,9 +1801,9 @@
             <w:tcW w:type="dxa" w:w="2280"/>
           </w:tcPr>
           <w:p>
-            <w:r w:eastAsiaFont="SimSun">
+            <w:r w:eastAsiaFont="Microsoft YaHei">
               <w:rPr>
-                <w:rFonts w:ascii="SimSun" w:hAnsi="SimSun"/>
+                <w:rFonts w:ascii="Microsoft YaHei" w:hAnsi="Microsoft YaHei"/>
                 <w:color w:val="D97706"/>
                 <w:sz w:val="20"/>
               </w:rPr>
@@ -1804,9 +1816,9 @@
             <w:tcW w:type="dxa" w:w="2280"/>
           </w:tcPr>
           <w:p>
-            <w:r w:eastAsiaFont="SimSun">
+            <w:r w:eastAsiaFont="Microsoft YaHei">
               <w:rPr>
-                <w:rFonts w:ascii="SimSun" w:hAnsi="SimSun"/>
+                <w:rFonts w:ascii="Microsoft YaHei" w:hAnsi="Microsoft YaHei"/>
                 <w:color w:val="1E293B"/>
                 <w:sz w:val="20"/>
               </w:rPr>
@@ -1821,9 +1833,9 @@
             <w:tcW w:type="dxa" w:w="2280"/>
           </w:tcPr>
           <w:p>
-            <w:r w:eastAsiaFont="SimSun">
+            <w:r w:eastAsiaFont="Microsoft YaHei">
               <w:rPr>
-                <w:rFonts w:ascii="SimSun" w:hAnsi="SimSun"/>
+                <w:rFonts w:ascii="Microsoft YaHei" w:hAnsi="Microsoft YaHei"/>
                 <w:color w:val="1E293B"/>
                 <w:sz w:val="20"/>
               </w:rPr>
@@ -1836,9 +1848,9 @@
             <w:tcW w:type="dxa" w:w="2280"/>
           </w:tcPr>
           <w:p>
-            <w:r w:eastAsiaFont="SimSun">
+            <w:r w:eastAsiaFont="Microsoft YaHei">
               <w:rPr>
-                <w:rFonts w:ascii="SimSun" w:hAnsi="SimSun"/>
+                <w:rFonts w:ascii="Microsoft YaHei" w:hAnsi="Microsoft YaHei"/>
                 <w:color w:val="1E293B"/>
                 <w:sz w:val="20"/>
               </w:rPr>
@@ -1851,9 +1863,9 @@
             <w:tcW w:type="dxa" w:w="2280"/>
           </w:tcPr>
           <w:p>
-            <w:r w:eastAsiaFont="SimSun">
+            <w:r w:eastAsiaFont="Microsoft YaHei">
               <w:rPr>
-                <w:rFonts w:ascii="SimSun" w:hAnsi="SimSun"/>
+                <w:rFonts w:ascii="Microsoft YaHei" w:hAnsi="Microsoft YaHei"/>
                 <w:color w:val="D97706"/>
                 <w:sz w:val="20"/>
               </w:rPr>
@@ -1866,9 +1878,9 @@
             <w:tcW w:type="dxa" w:w="2280"/>
           </w:tcPr>
           <w:p>
-            <w:r w:eastAsiaFont="SimSun">
+            <w:r w:eastAsiaFont="Microsoft YaHei">
               <w:rPr>
-                <w:rFonts w:ascii="SimSun" w:hAnsi="SimSun"/>
+                <w:rFonts w:ascii="Microsoft YaHei" w:hAnsi="Microsoft YaHei"/>
                 <w:color w:val="1E293B"/>
                 <w:sz w:val="20"/>
               </w:rPr>
@@ -1883,9 +1895,9 @@
             <w:tcW w:type="dxa" w:w="2280"/>
           </w:tcPr>
           <w:p>
-            <w:r w:eastAsiaFont="SimSun">
+            <w:r w:eastAsiaFont="Microsoft YaHei">
               <w:rPr>
-                <w:rFonts w:ascii="SimSun" w:hAnsi="SimSun"/>
+                <w:rFonts w:ascii="Microsoft YaHei" w:hAnsi="Microsoft YaHei"/>
                 <w:color w:val="1E293B"/>
                 <w:sz w:val="20"/>
               </w:rPr>
@@ -1898,9 +1910,9 @@
             <w:tcW w:type="dxa" w:w="2280"/>
           </w:tcPr>
           <w:p>
-            <w:r w:eastAsiaFont="SimSun">
+            <w:r w:eastAsiaFont="Microsoft YaHei">
               <w:rPr>
-                <w:rFonts w:ascii="SimSun" w:hAnsi="SimSun"/>
+                <w:rFonts w:ascii="Microsoft YaHei" w:hAnsi="Microsoft YaHei"/>
                 <w:color w:val="1E293B"/>
                 <w:sz w:val="20"/>
               </w:rPr>
@@ -1913,9 +1925,9 @@
             <w:tcW w:type="dxa" w:w="2280"/>
           </w:tcPr>
           <w:p>
-            <w:r w:eastAsiaFont="SimSun">
+            <w:r w:eastAsiaFont="Microsoft YaHei">
               <w:rPr>
-                <w:rFonts w:ascii="SimSun" w:hAnsi="SimSun"/>
+                <w:rFonts w:ascii="Microsoft YaHei" w:hAnsi="Microsoft YaHei"/>
                 <w:color w:val="D97706"/>
                 <w:sz w:val="20"/>
               </w:rPr>
@@ -1928,9 +1940,9 @@
             <w:tcW w:type="dxa" w:w="2280"/>
           </w:tcPr>
           <w:p>
-            <w:r w:eastAsiaFont="SimSun">
+            <w:r w:eastAsiaFont="Microsoft YaHei">
               <w:rPr>
-                <w:rFonts w:ascii="SimSun" w:hAnsi="SimSun"/>
+                <w:rFonts w:ascii="Microsoft YaHei" w:hAnsi="Microsoft YaHei"/>
                 <w:color w:val="1E293B"/>
                 <w:sz w:val="20"/>
               </w:rPr>
@@ -1945,9 +1957,9 @@
             <w:tcW w:type="dxa" w:w="2280"/>
           </w:tcPr>
           <w:p>
-            <w:r w:eastAsiaFont="SimSun">
+            <w:r w:eastAsiaFont="Microsoft YaHei">
               <w:rPr>
-                <w:rFonts w:ascii="SimSun" w:hAnsi="SimSun"/>
+                <w:rFonts w:ascii="Microsoft YaHei" w:hAnsi="Microsoft YaHei"/>
                 <w:color w:val="1E293B"/>
                 <w:sz w:val="20"/>
               </w:rPr>
@@ -1960,9 +1972,9 @@
             <w:tcW w:type="dxa" w:w="2280"/>
           </w:tcPr>
           <w:p>
-            <w:r w:eastAsiaFont="SimSun">
+            <w:r w:eastAsiaFont="Microsoft YaHei">
               <w:rPr>
-                <w:rFonts w:ascii="SimSun" w:hAnsi="SimSun"/>
+                <w:rFonts w:ascii="Microsoft YaHei" w:hAnsi="Microsoft YaHei"/>
                 <w:color w:val="1E293B"/>
                 <w:sz w:val="20"/>
               </w:rPr>
@@ -1975,9 +1987,9 @@
             <w:tcW w:type="dxa" w:w="2280"/>
           </w:tcPr>
           <w:p>
-            <w:r w:eastAsiaFont="SimSun">
+            <w:r w:eastAsiaFont="Microsoft YaHei">
               <w:rPr>
-                <w:rFonts w:ascii="SimSun" w:hAnsi="SimSun"/>
+                <w:rFonts w:ascii="Microsoft YaHei" w:hAnsi="Microsoft YaHei"/>
                 <w:color w:val="D97706"/>
                 <w:sz w:val="20"/>
               </w:rPr>
@@ -1990,9 +2002,9 @@
             <w:tcW w:type="dxa" w:w="2280"/>
           </w:tcPr>
           <w:p>
-            <w:r w:eastAsiaFont="SimSun">
+            <w:r w:eastAsiaFont="Microsoft YaHei">
               <w:rPr>
-                <w:rFonts w:ascii="SimSun" w:hAnsi="SimSun"/>
+                <w:rFonts w:ascii="Microsoft YaHei" w:hAnsi="Microsoft YaHei"/>
                 <w:color w:val="1E293B"/>
                 <w:sz w:val="20"/>
               </w:rPr>
@@ -2007,9 +2019,9 @@
             <w:tcW w:type="dxa" w:w="2280"/>
           </w:tcPr>
           <w:p>
-            <w:r w:eastAsiaFont="SimSun">
+            <w:r w:eastAsiaFont="Microsoft YaHei">
               <w:rPr>
-                <w:rFonts w:ascii="SimSun" w:hAnsi="SimSun"/>
+                <w:rFonts w:ascii="Microsoft YaHei" w:hAnsi="Microsoft YaHei"/>
                 <w:color w:val="1E293B"/>
                 <w:sz w:val="20"/>
               </w:rPr>
@@ -2022,9 +2034,9 @@
             <w:tcW w:type="dxa" w:w="2280"/>
           </w:tcPr>
           <w:p>
-            <w:r w:eastAsiaFont="SimSun">
+            <w:r w:eastAsiaFont="Microsoft YaHei">
               <w:rPr>
-                <w:rFonts w:ascii="SimSun" w:hAnsi="SimSun"/>
+                <w:rFonts w:ascii="Microsoft YaHei" w:hAnsi="Microsoft YaHei"/>
                 <w:color w:val="1E293B"/>
                 <w:sz w:val="20"/>
               </w:rPr>
@@ -2037,9 +2049,9 @@
             <w:tcW w:type="dxa" w:w="2280"/>
           </w:tcPr>
           <w:p>
-            <w:r w:eastAsiaFont="SimSun">
+            <w:r w:eastAsiaFont="Microsoft YaHei">
               <w:rPr>
-                <w:rFonts w:ascii="SimSun" w:hAnsi="SimSun"/>
+                <w:rFonts w:ascii="Microsoft YaHei" w:hAnsi="Microsoft YaHei"/>
                 <w:color w:val="D97706"/>
                 <w:sz w:val="20"/>
               </w:rPr>
@@ -2052,9 +2064,9 @@
             <w:tcW w:type="dxa" w:w="2280"/>
           </w:tcPr>
           <w:p>
-            <w:r w:eastAsiaFont="SimSun">
+            <w:r w:eastAsiaFont="Microsoft YaHei">
               <w:rPr>
-                <w:rFonts w:ascii="SimSun" w:hAnsi="SimSun"/>
+                <w:rFonts w:ascii="Microsoft YaHei" w:hAnsi="Microsoft YaHei"/>
                 <w:color w:val="1E293B"/>
                 <w:sz w:val="20"/>
               </w:rPr>
@@ -2069,9 +2081,9 @@
             <w:tcW w:type="dxa" w:w="2280"/>
           </w:tcPr>
           <w:p>
-            <w:r w:eastAsiaFont="SimSun">
+            <w:r w:eastAsiaFont="Microsoft YaHei">
               <w:rPr>
-                <w:rFonts w:ascii="SimSun" w:hAnsi="SimSun"/>
+                <w:rFonts w:ascii="Microsoft YaHei" w:hAnsi="Microsoft YaHei"/>
                 <w:color w:val="1E293B"/>
                 <w:sz w:val="20"/>
               </w:rPr>
@@ -2084,9 +2096,9 @@
             <w:tcW w:type="dxa" w:w="2280"/>
           </w:tcPr>
           <w:p>
-            <w:r w:eastAsiaFont="SimSun">
+            <w:r w:eastAsiaFont="Microsoft YaHei">
               <w:rPr>
-                <w:rFonts w:ascii="SimSun" w:hAnsi="SimSun"/>
+                <w:rFonts w:ascii="Microsoft YaHei" w:hAnsi="Microsoft YaHei"/>
                 <w:color w:val="1E293B"/>
                 <w:sz w:val="20"/>
               </w:rPr>
@@ -2099,9 +2111,9 @@
             <w:tcW w:type="dxa" w:w="2280"/>
           </w:tcPr>
           <w:p>
-            <w:r w:eastAsiaFont="SimSun">
+            <w:r w:eastAsiaFont="Microsoft YaHei">
               <w:rPr>
-                <w:rFonts w:ascii="SimSun" w:hAnsi="SimSun"/>
+                <w:rFonts w:ascii="Microsoft YaHei" w:hAnsi="Microsoft YaHei"/>
                 <w:color w:val="D97706"/>
                 <w:sz w:val="20"/>
               </w:rPr>
@@ -2114,9 +2126,9 @@
             <w:tcW w:type="dxa" w:w="2280"/>
           </w:tcPr>
           <w:p>
-            <w:r w:eastAsiaFont="SimSun">
+            <w:r w:eastAsiaFont="Microsoft YaHei">
               <w:rPr>
-                <w:rFonts w:ascii="SimSun" w:hAnsi="SimSun"/>
+                <w:rFonts w:ascii="Microsoft YaHei" w:hAnsi="Microsoft YaHei"/>
                 <w:color w:val="1E293B"/>
                 <w:sz w:val="20"/>
               </w:rPr>
@@ -2131,9 +2143,9 @@
             <w:tcW w:type="dxa" w:w="2280"/>
           </w:tcPr>
           <w:p>
-            <w:r w:eastAsiaFont="SimSun">
+            <w:r w:eastAsiaFont="Microsoft YaHei">
               <w:rPr>
-                <w:rFonts w:ascii="SimSun" w:hAnsi="SimSun"/>
+                <w:rFonts w:ascii="Microsoft YaHei" w:hAnsi="Microsoft YaHei"/>
                 <w:color w:val="1E293B"/>
                 <w:sz w:val="20"/>
               </w:rPr>
@@ -2146,9 +2158,9 @@
             <w:tcW w:type="dxa" w:w="2280"/>
           </w:tcPr>
           <w:p>
-            <w:r w:eastAsiaFont="SimSun">
+            <w:r w:eastAsiaFont="Microsoft YaHei">
               <w:rPr>
-                <w:rFonts w:ascii="SimSun" w:hAnsi="SimSun"/>
+                <w:rFonts w:ascii="Microsoft YaHei" w:hAnsi="Microsoft YaHei"/>
                 <w:color w:val="1E293B"/>
                 <w:sz w:val="20"/>
               </w:rPr>
@@ -2161,9 +2173,9 @@
             <w:tcW w:type="dxa" w:w="2280"/>
           </w:tcPr>
           <w:p>
-            <w:r w:eastAsiaFont="SimSun">
+            <w:r w:eastAsiaFont="Microsoft YaHei">
               <w:rPr>
-                <w:rFonts w:ascii="SimSun" w:hAnsi="SimSun"/>
+                <w:rFonts w:ascii="Microsoft YaHei" w:hAnsi="Microsoft YaHei"/>
                 <w:color w:val="D97706"/>
                 <w:sz w:val="20"/>
               </w:rPr>
@@ -2176,9 +2188,9 @@
             <w:tcW w:type="dxa" w:w="2280"/>
           </w:tcPr>
           <w:p>
-            <w:r w:eastAsiaFont="SimSun">
+            <w:r w:eastAsiaFont="Microsoft YaHei">
               <w:rPr>
-                <w:rFonts w:ascii="SimSun" w:hAnsi="SimSun"/>
+                <w:rFonts w:ascii="Microsoft YaHei" w:hAnsi="Microsoft YaHei"/>
                 <w:color w:val="1E293B"/>
                 <w:sz w:val="20"/>
               </w:rPr>
@@ -2192,9 +2204,10 @@
       <w:pPr>
         <w:pStyle w:val="Heading2"/>
       </w:pPr>
-      <w:r w:eastAsiaFont="SimHei">
+      <w:r w:eastAsiaFont="Microsoft YaHei">
         <w:rPr>
-          <w:rFonts w:ascii="SimHei" w:hAnsi="SimHei"/>
+          <w:rFonts w:ascii="Microsoft YaHei" w:hAnsi="Microsoft YaHei"/>
+          <w:b/>
           <w:color w:val="0F172A"/>
         </w:rPr>
         <w:t>创建自定义关卡</w:t>
@@ -2205,9 +2218,9 @@
         <w:ind w:firstLine="403"/>
         <w:jc w:val="both"/>
       </w:pPr>
-      <w:r w:eastAsiaFont="SimSun">
+      <w:r w:eastAsiaFont="Microsoft YaHei">
         <w:rPr>
-          <w:rFonts w:ascii="SimSun" w:hAnsi="SimSun"/>
+          <w:rFonts w:ascii="Microsoft YaHei" w:hAnsi="Microsoft YaHei"/>
           <w:sz w:val="22"/>
         </w:rPr>
         <w:t>你可以在 levels/ 目录下创建自己的关卡文件（txt格式），并按照命名规则将其加入游戏：</w:t>
@@ -2231,7 +2244,7 @@
           <w:p>
             <w:r>
               <w:rPr>
-                <w:rFonts w:ascii="Consolas" w:hAnsi="Consolas"/>
+                <w:rFonts w:ascii="Courier New" w:hAnsi="Courier New"/>
                 <w:color w:val="1E293B"/>
                 <w:sz w:val="20"/>
               </w:rPr>
@@ -2258,9 +2271,9 @@
         <w:ind w:firstLine="403"/>
         <w:jc w:val="both"/>
       </w:pPr>
-      <w:r w:eastAsiaFont="SimSun">
+      <w:r w:eastAsiaFont="Microsoft YaHei">
         <w:rPr>
-          <w:rFonts w:ascii="SimSun" w:hAnsi="SimSun"/>
+          <w:rFonts w:ascii="Microsoft YaHei" w:hAnsi="Microsoft YaHei"/>
           <w:sz w:val="22"/>
         </w:rPr>
         <w:t>在文件中上述字符构建你的关卡布局。文件名建议使用 level_XX.txt 格式，其中 XX 为数字（如 level_08.txt），用于确定关卡顺序。</w:t>
@@ -2271,9 +2284,10 @@
       <w:pPr>
         <w:pStyle w:val="Heading1"/>
       </w:pPr>
-      <w:r w:eastAsiaFont="SimHei">
+      <w:r w:eastAsiaFont="Microsoft YaHei">
         <w:rPr>
-          <w:rFonts w:ascii="SimHei" w:hAnsi="SimHei"/>
+          <w:rFonts w:ascii="Microsoft YaHei" w:hAnsi="Microsoft YaHei"/>
+          <w:b/>
           <w:color w:val="0F172A"/>
         </w:rPr>
         <w:t>第五章  技巧与策略</w:t>
@@ -2295,9 +2309,10 @@
       <w:pPr>
         <w:pStyle w:val="Heading2"/>
       </w:pPr>
-      <w:r w:eastAsiaFont="SimHei">
+      <w:r w:eastAsiaFont="Microsoft YaHei">
         <w:rPr>
-          <w:rFonts w:ascii="SimHei" w:hAnsi="SimHei"/>
+          <w:rFonts w:ascii="Microsoft YaHei" w:hAnsi="Microsoft YaHei"/>
+          <w:b/>
           <w:color w:val="0F172A"/>
         </w:rPr>
         <w:t>一  新手建议</w:t>
@@ -2308,9 +2323,9 @@
         <w:ind w:firstLine="403"/>
         <w:jc w:val="both"/>
       </w:pPr>
-      <w:r w:eastAsiaFont="SimSun">
+      <w:r w:eastAsiaFont="Microsoft YaHei">
         <w:rPr>
-          <w:rFonts w:ascii="SimSun" w:hAnsi="SimSun"/>
+          <w:rFonts w:ascii="Microsoft YaHei" w:hAnsi="Microsoft YaHei"/>
           <w:sz w:val="22"/>
         </w:rPr>
         <w:t>一  从第一关开始，不要急于推箱子。先观察全局布局，想好策略再行动。</w:t>
@@ -2321,9 +2336,9 @@
         <w:ind w:firstLine="403"/>
         <w:jc w:val="both"/>
       </w:pPr>
-      <w:r w:eastAsiaFont="SimSun">
+      <w:r w:eastAsiaFont="Microsoft YaHei">
         <w:rPr>
-          <w:rFonts w:ascii="SimSun" w:hAnsi="SimSun"/>
+          <w:rFonts w:ascii="Microsoft YaHei" w:hAnsi="Microsoft YaHei"/>
           <w:sz w:val="22"/>
         </w:rPr>
         <w:t>二  养成使用 Undo 的习惯。不确定的操作一定要按 Z 撤回，不要怕花时间。</w:t>
@@ -2334,9 +2349,9 @@
         <w:ind w:firstLine="403"/>
         <w:jc w:val="both"/>
       </w:pPr>
-      <w:r w:eastAsiaFont="SimSun">
+      <w:r w:eastAsiaFont="Microsoft YaHei">
         <w:rPr>
-          <w:rFonts w:ascii="SimSun" w:hAnsi="SimSun"/>
+          <w:rFonts w:ascii="Microsoft YaHei" w:hAnsi="Microsoft YaHei"/>
           <w:sz w:val="22"/>
         </w:rPr>
         <w:t>三  记住关卡的目标位置和箱子数量，这帮助了你判断进展。</w:t>
@@ -2346,9 +2361,10 @@
       <w:pPr>
         <w:pStyle w:val="Heading2"/>
       </w:pPr>
-      <w:r w:eastAsiaFont="SimHei">
+      <w:r w:eastAsiaFont="Microsoft YaHei">
         <w:rPr>
-          <w:rFonts w:ascii="SimHei" w:hAnsi="SimHei"/>
+          <w:rFonts w:ascii="Microsoft YaHei" w:hAnsi="Microsoft YaHei"/>
+          <w:b/>
           <w:color w:val="0F172A"/>
         </w:rPr>
         <w:t>二  中级策略</w:t>
@@ -2374,18 +2390,18 @@
             <w:shd w:fill="FEF3C7" w:val="clear"/>
           </w:tcPr>
           <w:p>
-            <w:r w:eastAsiaFont="SimHei">
+            <w:r w:eastAsiaFont="Microsoft YaHei">
               <w:rPr>
-                <w:rFonts w:ascii="SimHei" w:hAnsi="SimHei"/>
+                <w:rFonts w:ascii="Microsoft YaHei" w:hAnsi="Microsoft YaHei"/>
                 <w:b/>
                 <w:color w:val="D97706"/>
                 <w:sz w:val="20"/>
               </w:rPr>
               <w:t xml:space="preserve">避免角落陷阱 </w:t>
             </w:r>
-            <w:r w:eastAsiaFont="SimSun">
+            <w:r w:eastAsiaFont="Microsoft YaHei">
               <w:rPr>
-                <w:rFonts w:ascii="SimSun" w:hAnsi="SimSun"/>
+                <w:rFonts w:ascii="Microsoft YaHei" w:hAnsi="Microsoft YaHei"/>
                 <w:color w:val="1E293B"/>
                 <w:sz w:val="20"/>
               </w:rPr>
@@ -2415,18 +2431,18 @@
             <w:shd w:fill="FEF3C7" w:val="clear"/>
           </w:tcPr>
           <w:p>
-            <w:r w:eastAsiaFont="SimHei">
+            <w:r w:eastAsiaFont="Microsoft YaHei">
               <w:rPr>
-                <w:rFonts w:ascii="SimHei" w:hAnsi="SimHei"/>
+                <w:rFonts w:ascii="Microsoft YaHei" w:hAnsi="Microsoft YaHei"/>
                 <w:b/>
                 <w:color w:val="D97706"/>
                 <w:sz w:val="20"/>
               </w:rPr>
               <w:t xml:space="preserve">一次只推一个箱子 </w:t>
             </w:r>
-            <w:r w:eastAsiaFont="SimSun">
+            <w:r w:eastAsiaFont="Microsoft YaHei">
               <w:rPr>
-                <w:rFonts w:ascii="SimSun" w:hAnsi="SimSun"/>
+                <w:rFonts w:ascii="Microsoft YaHei" w:hAnsi="Microsoft YaHei"/>
                 <w:color w:val="1E293B"/>
                 <w:sz w:val="20"/>
               </w:rPr>
@@ -2456,18 +2472,18 @@
             <w:shd w:fill="FEF3C7" w:val="clear"/>
           </w:tcPr>
           <w:p>
-            <w:r w:eastAsiaFont="SimHei">
+            <w:r w:eastAsiaFont="Microsoft YaHei">
               <w:rPr>
-                <w:rFonts w:ascii="SimHei" w:hAnsi="SimHei"/>
+                <w:rFonts w:ascii="Microsoft YaHei" w:hAnsi="Microsoft YaHei"/>
                 <w:b/>
                 <w:color w:val="D97706"/>
                 <w:sz w:val="20"/>
               </w:rPr>
               <w:t xml:space="preserve">先推远的，再推近的 </w:t>
             </w:r>
-            <w:r w:eastAsiaFont="SimSun">
+            <w:r w:eastAsiaFont="Microsoft YaHei">
               <w:rPr>
-                <w:rFonts w:ascii="SimSun" w:hAnsi="SimSun"/>
+                <w:rFonts w:ascii="Microsoft YaHei" w:hAnsi="Microsoft YaHei"/>
                 <w:color w:val="1E293B"/>
                 <w:sz w:val="20"/>
               </w:rPr>
@@ -2481,9 +2497,10 @@
       <w:pPr>
         <w:pStyle w:val="Heading2"/>
       </w:pPr>
-      <w:r w:eastAsiaFont="SimHei">
+      <w:r w:eastAsiaFont="Microsoft YaHei">
         <w:rPr>
-          <w:rFonts w:ascii="SimHei" w:hAnsi="SimHei"/>
+          <w:rFonts w:ascii="Microsoft YaHei" w:hAnsi="Microsoft YaHei"/>
+          <w:b/>
           <w:color w:val="0F172A"/>
         </w:rPr>
         <w:t>三  高级技巧</w:t>
@@ -2509,18 +2526,18 @@
             <w:shd w:fill="FEF3C7" w:val="clear"/>
           </w:tcPr>
           <w:p>
-            <w:r w:eastAsiaFont="SimHei">
+            <w:r w:eastAsiaFont="Microsoft YaHei">
               <w:rPr>
-                <w:rFonts w:ascii="SimHei" w:hAnsi="SimHei"/>
+                <w:rFonts w:ascii="Microsoft YaHei" w:hAnsi="Microsoft YaHei"/>
                 <w:b/>
                 <w:color w:val="D97706"/>
                 <w:sz w:val="20"/>
               </w:rPr>
               <w:t xml:space="preserve">回旋法 </w:t>
             </w:r>
-            <w:r w:eastAsiaFont="SimSun">
+            <w:r w:eastAsiaFont="Microsoft YaHei">
               <w:rPr>
-                <w:rFonts w:ascii="SimSun" w:hAnsi="SimSun"/>
+                <w:rFonts w:ascii="Microsoft YaHei" w:hAnsi="Microsoft YaHei"/>
                 <w:color w:val="1E293B"/>
                 <w:sz w:val="20"/>
               </w:rPr>
@@ -2550,18 +2567,18 @@
             <w:shd w:fill="FEF3C7" w:val="clear"/>
           </w:tcPr>
           <w:p>
-            <w:r w:eastAsiaFont="SimHei">
+            <w:r w:eastAsiaFont="Microsoft YaHei">
               <w:rPr>
-                <w:rFonts w:ascii="SimHei" w:hAnsi="SimHei"/>
+                <w:rFonts w:ascii="Microsoft YaHei" w:hAnsi="Microsoft YaHei"/>
                 <w:b/>
                 <w:color w:val="D97706"/>
                 <w:sz w:val="20"/>
               </w:rPr>
               <w:t xml:space="preserve">路径预览 </w:t>
             </w:r>
-            <w:r w:eastAsiaFont="SimSun">
+            <w:r w:eastAsiaFont="Microsoft YaHei">
               <w:rPr>
-                <w:rFonts w:ascii="SimSun" w:hAnsi="SimSun"/>
+                <w:rFonts w:ascii="Microsoft YaHei" w:hAnsi="Microsoft YaHei"/>
                 <w:color w:val="1E293B"/>
                 <w:sz w:val="20"/>
               </w:rPr>
@@ -2591,18 +2608,18 @@
             <w:shd w:fill="FEF3C7" w:val="clear"/>
           </w:tcPr>
           <w:p>
-            <w:r w:eastAsiaFont="SimHei">
+            <w:r w:eastAsiaFont="Microsoft YaHei">
               <w:rPr>
-                <w:rFonts w:ascii="SimHei" w:hAnsi="SimHei"/>
+                <w:rFonts w:ascii="Microsoft YaHei" w:hAnsi="Microsoft YaHei"/>
                 <w:b/>
                 <w:color w:val="D97706"/>
                 <w:sz w:val="20"/>
               </w:rPr>
               <w:t xml:space="preserve">利用目标位作为假路径 </w:t>
             </w:r>
-            <w:r w:eastAsiaFont="SimSun">
+            <w:r w:eastAsiaFont="Microsoft YaHei">
               <w:rPr>
-                <w:rFonts w:ascii="SimSun" w:hAnsi="SimSun"/>
+                <w:rFonts w:ascii="Microsoft YaHei" w:hAnsi="Microsoft YaHei"/>
                 <w:color w:val="1E293B"/>
                 <w:sz w:val="20"/>
               </w:rPr>
@@ -2632,18 +2649,18 @@
             <w:shd w:fill="FEF3C7" w:val="clear"/>
           </w:tcPr>
           <w:p>
-            <w:r w:eastAsiaFont="SimHei">
+            <w:r w:eastAsiaFont="Microsoft YaHei">
               <w:rPr>
-                <w:rFonts w:ascii="SimHei" w:hAnsi="SimHei"/>
+                <w:rFonts w:ascii="Microsoft YaHei" w:hAnsi="Microsoft YaHei"/>
                 <w:b/>
                 <w:color w:val="D97706"/>
                 <w:sz w:val="20"/>
               </w:rPr>
               <w:t xml:space="preserve">经验总结 </w:t>
             </w:r>
-            <w:r w:eastAsiaFont="SimSun">
+            <w:r w:eastAsiaFont="Microsoft YaHei">
               <w:rPr>
-                <w:rFonts w:ascii="SimSun" w:hAnsi="SimSun"/>
+                <w:rFonts w:ascii="Microsoft YaHei" w:hAnsi="Microsoft YaHei"/>
                 <w:color w:val="1E293B"/>
                 <w:sz w:val="20"/>
               </w:rPr>
@@ -2658,9 +2675,10 @@
       <w:pPr>
         <w:pStyle w:val="Heading1"/>
       </w:pPr>
-      <w:r w:eastAsiaFont="SimHei">
+      <w:r w:eastAsiaFont="Microsoft YaHei">
         <w:rPr>
-          <w:rFonts w:ascii="SimHei" w:hAnsi="SimHei"/>
+          <w:rFonts w:ascii="Microsoft YaHei" w:hAnsi="Microsoft YaHei"/>
+          <w:b/>
           <w:color w:val="0F172A"/>
         </w:rPr>
         <w:t>第六章  常见问题</w:t>
@@ -2698,18 +2716,18 @@
             <w:shd w:fill="FEF3C7" w:val="clear"/>
           </w:tcPr>
           <w:p>
-            <w:r w:eastAsiaFont="SimHei">
+            <w:r w:eastAsiaFont="Microsoft YaHei">
               <w:rPr>
-                <w:rFonts w:ascii="SimHei" w:hAnsi="SimHei"/>
+                <w:rFonts w:ascii="Microsoft YaHei" w:hAnsi="Microsoft YaHei"/>
                 <w:b/>
                 <w:color w:val="D97706"/>
                 <w:sz w:val="20"/>
               </w:rPr>
               <w:t xml:space="preserve">游戏打不开 </w:t>
             </w:r>
-            <w:r w:eastAsiaFont="SimSun">
+            <w:r w:eastAsiaFont="Microsoft YaHei">
               <w:rPr>
-                <w:rFonts w:ascii="SimSun" w:hAnsi="SimSun"/>
+                <w:rFonts w:ascii="Microsoft YaHei" w:hAnsi="Microsoft YaHei"/>
                 <w:color w:val="1E293B"/>
                 <w:sz w:val="20"/>
               </w:rPr>
@@ -2739,18 +2757,18 @@
             <w:shd w:fill="FEF3C7" w:val="clear"/>
           </w:tcPr>
           <w:p>
-            <w:r w:eastAsiaFont="SimHei">
+            <w:r w:eastAsiaFont="Microsoft YaHei">
               <w:rPr>
-                <w:rFonts w:ascii="SimHei" w:hAnsi="SimHei"/>
+                <w:rFonts w:ascii="Microsoft YaHei" w:hAnsi="Microsoft YaHei"/>
                 <w:b/>
                 <w:color w:val="D97706"/>
                 <w:sz w:val="20"/>
               </w:rPr>
               <w:t xml:space="preserve">关卡卡住了怎么办 </w:t>
             </w:r>
-            <w:r w:eastAsiaFont="SimSun">
+            <w:r w:eastAsiaFont="Microsoft YaHei">
               <w:rPr>
-                <w:rFonts w:ascii="SimSun" w:hAnsi="SimSun"/>
+                <w:rFonts w:ascii="Microsoft YaHei" w:hAnsi="Microsoft YaHei"/>
                 <w:color w:val="1E293B"/>
                 <w:sz w:val="20"/>
               </w:rPr>
@@ -2780,18 +2798,18 @@
             <w:shd w:fill="FEF3C7" w:val="clear"/>
           </w:tcPr>
           <w:p>
-            <w:r w:eastAsiaFont="SimHei">
+            <w:r w:eastAsiaFont="Microsoft YaHei">
               <w:rPr>
-                <w:rFonts w:ascii="SimHei" w:hAnsi="SimHei"/>
+                <w:rFonts w:ascii="Microsoft YaHei" w:hAnsi="Microsoft YaHei"/>
                 <w:b/>
                 <w:color w:val="D97706"/>
                 <w:sz w:val="20"/>
               </w:rPr>
               <w:t xml:space="preserve">过关后没反应 </w:t>
             </w:r>
-            <w:r w:eastAsiaFont="SimSun">
+            <w:r w:eastAsiaFont="Microsoft YaHei">
               <w:rPr>
-                <w:rFonts w:ascii="SimSun" w:hAnsi="SimSun"/>
+                <w:rFonts w:ascii="Microsoft YaHei" w:hAnsi="Microsoft YaHei"/>
                 <w:color w:val="1E293B"/>
                 <w:sz w:val="20"/>
               </w:rPr>
@@ -2821,18 +2839,18 @@
             <w:shd w:fill="FEF3C7" w:val="clear"/>
           </w:tcPr>
           <w:p>
-            <w:r w:eastAsiaFont="SimHei">
+            <w:r w:eastAsiaFont="Microsoft YaHei">
               <w:rPr>
-                <w:rFonts w:ascii="SimHei" w:hAnsi="SimHei"/>
+                <w:rFonts w:ascii="Microsoft YaHei" w:hAnsi="Microsoft YaHei"/>
                 <w:b/>
                 <w:color w:val="D97706"/>
                 <w:sz w:val="20"/>
               </w:rPr>
               <w:t xml:space="preserve">如何添加自制关卡 </w:t>
             </w:r>
-            <w:r w:eastAsiaFont="SimSun">
+            <w:r w:eastAsiaFont="Microsoft YaHei">
               <w:rPr>
-                <w:rFonts w:ascii="SimSun" w:hAnsi="SimSun"/>
+                <w:rFonts w:ascii="Microsoft YaHei" w:hAnsi="Microsoft YaHei"/>
                 <w:color w:val="1E293B"/>
                 <w:sz w:val="20"/>
               </w:rPr>
@@ -2862,18 +2880,18 @@
             <w:shd w:fill="FEF3C7" w:val="clear"/>
           </w:tcPr>
           <w:p>
-            <w:r w:eastAsiaFont="SimHei">
+            <w:r w:eastAsiaFont="Microsoft YaHei">
               <w:rPr>
-                <w:rFonts w:ascii="SimHei" w:hAnsi="SimHei"/>
+                <w:rFonts w:ascii="Microsoft YaHei" w:hAnsi="Microsoft YaHei"/>
                 <w:b/>
                 <w:color w:val="D97706"/>
                 <w:sz w:val="20"/>
               </w:rPr>
               <w:t xml:space="preserve">屏幕尺寸不合适 </w:t>
             </w:r>
-            <w:r w:eastAsiaFont="SimSun">
+            <w:r w:eastAsiaFont="Microsoft YaHei">
               <w:rPr>
-                <w:rFonts w:ascii="SimSun" w:hAnsi="SimSun"/>
+                <w:rFonts w:ascii="Microsoft YaHei" w:hAnsi="Microsoft YaHei"/>
                 <w:color w:val="1E293B"/>
                 <w:sz w:val="20"/>
               </w:rPr>
@@ -2901,9 +2919,9 @@
         <w:ind w:firstLine="403"/>
         <w:jc w:val="both"/>
       </w:pPr>
-      <w:r w:eastAsiaFont="SimSun">
+      <w:r w:eastAsiaFont="Microsoft YaHei">
         <w:rPr>
-          <w:rFonts w:ascii="SimSun" w:hAnsi="SimSun"/>
+          <w:rFonts w:ascii="Microsoft YaHei" w:hAnsi="Microsoft YaHei"/>
           <w:sz w:val="22"/>
         </w:rPr>
         <w:t>感谢使用推箱子游戏！</w:t>
@@ -2914,9 +2932,9 @@
         <w:ind w:firstLine="403"/>
         <w:jc w:val="both"/>
       </w:pPr>
-      <w:r w:eastAsiaFont="SimSun">
+      <w:r w:eastAsiaFont="Microsoft YaHei">
         <w:rPr>
-          <w:rFonts w:ascii="SimSun" w:hAnsi="SimSun"/>
+          <w:rFonts w:ascii="Microsoft YaHei" w:hAnsi="Microsoft YaHei"/>
           <w:sz w:val="22"/>
         </w:rPr>
         <w:t>游戏项目地址：https://github.com/qianluxi/push_box</w:t>
@@ -2927,9 +2945,9 @@
         <w:ind w:firstLine="403"/>
         <w:jc w:val="both"/>
       </w:pPr>
-      <w:r w:eastAsiaFont="SimSun">
+      <w:r w:eastAsiaFont="Microsoft YaHei">
         <w:rPr>
-          <w:rFonts w:ascii="SimSun" w:hAnsi="SimSun"/>
+          <w:rFonts w:ascii="Microsoft YaHei" w:hAnsi="Microsoft YaHei"/>
           <w:sz w:val="22"/>
         </w:rPr>
         <w:t>本手册基于 V1.1 版本编写。</w:t>
@@ -2940,9 +2958,9 @@
         <w:ind w:firstLine="403"/>
         <w:jc w:val="both"/>
       </w:pPr>
-      <w:r w:eastAsiaFont="SimSun">
+      <w:r w:eastAsiaFont="Microsoft YaHei">
         <w:rPr>
-          <w:rFonts w:ascii="SimSun" w:hAnsi="SimSun"/>
+          <w:rFonts w:ascii="Microsoft YaHei" w:hAnsi="Microsoft YaHei"/>
           <w:sz w:val="22"/>
         </w:rPr>
         <w:t>推箱子（Sokoban）由 Johan Stevanne 于 1981 年创作，是一种经典智力游戏。本项目为现代 Python 实现，仅供学习与探索。</w:t>

</xml_diff>